<commit_message>
docs: set Himanshu Goyal (24BDA70369) as sole author and update academic session to 2026-2027 across README, DOCX report, and PPTX presentation
</commit_message>
<xml_diff>
--- a/TRAIN_TICKET_BOOKING_SYSTEM_PROJECT_REPORT.docx
+++ b/TRAIN_TICKET_BOOKING_SYSTEM_PROJECT_REPORT.docx
@@ -59,45 +59,17 @@
     </w:p>
     <w:p>
       <w:pPr>
-        <w:spacing w:after="40"/>
-        <w:jc w:val="center"/>
-      </w:pPr>
-      <w:r>
-        <w:rPr>
-          <w:b/>
-          <w:sz w:val="26"/>
-        </w:rPr>
-        <w:t>HIMANSHU GOYAL</w:t>
-        <w:br/>
-        <w:t>24BDA70369</w:t>
-      </w:r>
-    </w:p>
-    <w:p>
-      <w:pPr>
-        <w:spacing w:after="40"/>
-        <w:jc w:val="center"/>
-      </w:pPr>
-      <w:r>
-        <w:rPr>
-          <w:b/>
-          <w:sz w:val="24"/>
-        </w:rPr>
-        <w:t>&amp;</w:t>
-      </w:r>
-    </w:p>
-    <w:p>
-      <w:pPr>
         <w:spacing w:after="560"/>
         <w:jc w:val="center"/>
       </w:pPr>
       <w:r>
         <w:rPr>
           <w:b/>
-          <w:sz w:val="26"/>
+          <w:sz w:val="28"/>
         </w:rPr>
-        <w:t>ABHISHEK YADAV</w:t>
+        <w:t>HIMANSHU GOYAL</w:t>
         <w:br/>
-        <w:t>24BDA70298</w:t>
+        <w:t>UID: 24BDA70369</w:t>
       </w:r>
     </w:p>
     <w:p>
@@ -172,7 +144,7 @@
     </w:p>
     <w:p>
       <w:pPr>
-        <w:spacing w:after="40"/>
+        <w:spacing w:after="560"/>
         <w:jc w:val="center"/>
       </w:pPr>
       <w:r>
@@ -192,7 +164,7 @@
         <w:rPr>
           <w:sz w:val="24"/>
         </w:rPr>
-        <w:t>2025 – 2026</w:t>
+        <w:t>2026 – 2027</w:t>
       </w:r>
     </w:p>
     <w:p>
@@ -273,7 +245,7 @@
         <w:jc w:val="both"/>
       </w:pPr>
       <w:r>
-        <w:t>Certified that this project report "TRAIN TICKET BOOKING SYSTEM" is the bonafide work of "HIMANSHU GOYAL (24BDA70369) &amp; ABHISHEK YADAV (24BDA70298)" who carried out the project work under my/our supervision.</w:t>
+        <w:t>Certified that this project report "TRAIN TICKET BOOKING SYSTEM" is the bonafide work of "HIMANSHU GOYAL (UID: 24BDA70369)" who carried out the project work under my supervision.</w:t>
       </w:r>
     </w:p>
     <w:tbl>
@@ -499,7 +471,7 @@
         <w:jc w:val="both"/>
       </w:pPr>
       <w:r>
-        <w:t>I hereby declare that the project report entitled "Train Ticket Booking System" submitted to Chandigarh University in partial fulfillment of the requirements for the award of the degree of Bachelor of Engineering (Hons.) in Computer Science and Engineering (Data Science) is a record of original work done by us under the supervision of Mr. Dheeresh Aggarwal, Assistant Professor, Department of AIT-CSE, Chandigarh University.</w:t>
+        <w:t>I hereby declare that the project report entitled "Train Ticket Booking System" submitted to Chandigarh University in partial fulfillment of the requirements for the award of the degree of Bachelor of Engineering (Hons.) in Computer Science and Engineering (Data Science) is a record of original work done by me under the supervision of Mr. Dheeresh Aggarwal, Assistant Professor, Department of AIT-CSE, Chandigarh University.</w:t>
       </w:r>
     </w:p>
     <w:p>
@@ -538,12 +510,7 @@
         </w:rPr>
         <w:t>Himanshu Goyal</w:t>
         <w:br/>
-        <w:t>24BDA70369</w:t>
-        <w:br/>
-        <w:br/>
-        <w:t>Abhishek Yadav</w:t>
-        <w:br/>
-        <w:t>24BDA70298</w:t>
+        <w:t>UID: 24BDA70369</w:t>
         <w:br/>
         <w:br/>
       </w:r>
@@ -678,12 +645,7 @@
         </w:rPr>
         <w:t>Himanshu Goyal</w:t>
         <w:br/>
-        <w:t>24BDA70369</w:t>
-        <w:br/>
-        <w:br/>
-        <w:t>Abhishek Yadav</w:t>
-        <w:br/>
-        <w:t>24BDA70298</w:t>
+        <w:t>UID: 24BDA70369</w:t>
       </w:r>
     </w:p>
     <w:p>
@@ -21685,7 +21647,7 @@
                 <w:color w:val="1E293B"/>
                 <w:sz w:val="18"/>
               </w:rPr>
-              <w:t>Candidate Names</w:t>
+              <w:t>Candidate Name</w:t>
             </w:r>
           </w:p>
         </w:tc>
@@ -21709,7 +21671,7 @@
                 <w:color w:val="1E293B"/>
                 <w:sz w:val="18"/>
               </w:rPr>
-              <w:t>Himanshu Goyal &amp; Abhishek Yadav</w:t>
+              <w:t>Himanshu Goyal</w:t>
             </w:r>
           </w:p>
         </w:tc>
@@ -21735,7 +21697,7 @@
                 <w:color w:val="1E293B"/>
                 <w:sz w:val="18"/>
               </w:rPr>
-              <w:t>University Roll Nos.</w:t>
+              <w:t>University Roll No. (UID)</w:t>
             </w:r>
           </w:p>
         </w:tc>
@@ -21759,7 +21721,7 @@
                 <w:color w:val="1E293B"/>
                 <w:sz w:val="18"/>
               </w:rPr>
-              <w:t>24BDA70369 &amp; 24BDA70298</w:t>
+              <w:t>24BDA70369</w:t>
             </w:r>
           </w:p>
         </w:tc>
@@ -21959,7 +21921,7 @@
                 <w:color w:val="1E293B"/>
                 <w:sz w:val="18"/>
               </w:rPr>
-              <w:t>2025 – 2026</w:t>
+              <w:t>2026 – 2027</w:t>
             </w:r>
           </w:p>
         </w:tc>
@@ -22009,7 +21971,7 @@
                 <w:color w:val="1E293B"/>
                 <w:sz w:val="18"/>
               </w:rPr>
-              <w:t>https://github.com/thehimanshugoyl/train-booking-24bda70369</w:t>
+              <w:t>https://github.com/thehimanshugoyl/gaddvya_trainbooking</w:t>
             </w:r>
           </w:p>
         </w:tc>

</xml_diff>

<commit_message>
docs(author): update author email to goyalhimanshu1326@gmail.com and sync academic deliverables
</commit_message>
<xml_diff>
--- a/TRAIN_TICKET_BOOKING_SYSTEM_PROJECT_REPORT.docx
+++ b/TRAIN_TICKET_BOOKING_SYSTEM_PROJECT_REPORT.docx
@@ -21697,7 +21697,7 @@
                 <w:color w:val="1E293B"/>
                 <w:sz w:val="18"/>
               </w:rPr>
-              <w:t>University Roll No. (UID)</w:t>
+              <w:t>Candidate Email</w:t>
             </w:r>
           </w:p>
         </w:tc>
@@ -21721,7 +21721,7 @@
                 <w:color w:val="1E293B"/>
                 <w:sz w:val="18"/>
               </w:rPr>
-              <w:t>24BDA70369</w:t>
+              <w:t>goyalhimanshu1326@gmail.com</w:t>
             </w:r>
           </w:p>
         </w:tc>
@@ -21747,7 +21747,7 @@
                 <w:color w:val="1E293B"/>
                 <w:sz w:val="18"/>
               </w:rPr>
-              <w:t>Degree Programme</w:t>
+              <w:t>University Roll No. (UID)</w:t>
             </w:r>
           </w:p>
         </w:tc>
@@ -21771,7 +21771,7 @@
                 <w:color w:val="1E293B"/>
                 <w:sz w:val="18"/>
               </w:rPr>
-              <w:t>B.E. (Hons.) Computer Science &amp; Engineering (Data Science)</w:t>
+              <w:t>24BDA70369</w:t>
             </w:r>
           </w:p>
         </w:tc>
@@ -21797,7 +21797,7 @@
                 <w:color w:val="1E293B"/>
                 <w:sz w:val="18"/>
               </w:rPr>
-              <w:t>Project Supervisor</w:t>
+              <w:t>Degree Programme</w:t>
             </w:r>
           </w:p>
         </w:tc>
@@ -21821,7 +21821,7 @@
                 <w:color w:val="1E293B"/>
                 <w:sz w:val="18"/>
               </w:rPr>
-              <w:t>Mr. Dheeresh Aggarwal, Assistant Professor</w:t>
+              <w:t>B.E. (Hons.) Computer Science &amp; Engineering (Data Science)</w:t>
             </w:r>
           </w:p>
         </w:tc>
@@ -21847,7 +21847,7 @@
                 <w:color w:val="1E293B"/>
                 <w:sz w:val="18"/>
               </w:rPr>
-              <w:t>Academic Department</w:t>
+              <w:t>Project Supervisor</w:t>
             </w:r>
           </w:p>
         </w:tc>
@@ -21871,7 +21871,7 @@
                 <w:color w:val="1E293B"/>
                 <w:sz w:val="18"/>
               </w:rPr>
-              <w:t>Department of AIT-CSE, Chandigarh University</w:t>
+              <w:t>Mr. Dheeresh Aggarwal, Assistant Professor</w:t>
             </w:r>
           </w:p>
         </w:tc>
@@ -21897,7 +21897,7 @@
                 <w:color w:val="1E293B"/>
                 <w:sz w:val="18"/>
               </w:rPr>
-              <w:t>Academic Session</w:t>
+              <w:t>Academic Department</w:t>
             </w:r>
           </w:p>
         </w:tc>
@@ -21921,7 +21921,7 @@
                 <w:color w:val="1E293B"/>
                 <w:sz w:val="18"/>
               </w:rPr>
-              <w:t>2026 – 2027</w:t>
+              <w:t>Department of AIT-CSE, Chandigarh University</w:t>
             </w:r>
           </w:p>
         </w:tc>
@@ -21947,7 +21947,7 @@
                 <w:color w:val="1E293B"/>
                 <w:sz w:val="18"/>
               </w:rPr>
-              <w:t>GitHub Repository</w:t>
+              <w:t>Academic Session</w:t>
             </w:r>
           </w:p>
         </w:tc>
@@ -21971,7 +21971,7 @@
                 <w:color w:val="1E293B"/>
                 <w:sz w:val="18"/>
               </w:rPr>
-              <w:t>https://github.com/thehimanshugoyl/gaddvya_trainbooking</w:t>
+              <w:t>2026 – 2027</w:t>
             </w:r>
           </w:p>
         </w:tc>
@@ -21997,7 +21997,7 @@
                 <w:color w:val="1E293B"/>
                 <w:sz w:val="18"/>
               </w:rPr>
-              <w:t>Production URL</w:t>
+              <w:t>GitHub Repository</w:t>
             </w:r>
           </w:p>
         </w:tc>
@@ -22021,7 +22021,7 @@
                 <w:color w:val="1E293B"/>
                 <w:sz w:val="18"/>
               </w:rPr>
-              <w:t>https://train-booking-24bda70369-lgzn.vercel.app</w:t>
+              <w:t>https://github.com/thehimanshugoyl/gaddvya_trainbooking</w:t>
             </w:r>
           </w:p>
         </w:tc>
@@ -22047,7 +22047,7 @@
                 <w:color w:val="1E293B"/>
                 <w:sz w:val="18"/>
               </w:rPr>
-              <w:t>Core Technology Stack</w:t>
+              <w:t>Production URL</w:t>
             </w:r>
           </w:p>
         </w:tc>
@@ -22055,6 +22055,56 @@
           <w:tcPr>
             <w:tcW w:type="dxa" w:w="5760"/>
             <w:shd w:fill="F8FAFC"/>
+            <w:tcMar>
+              <w:top w:w="80" w:type="dxa"/>
+              <w:bottom w:w="80" w:type="dxa"/>
+              <w:left w:w="140" w:type="dxa"/>
+              <w:right w:w="140" w:type="dxa"/>
+            </w:tcMar>
+          </w:tcPr>
+          <w:p>
+            <w:pPr>
+              <w:jc w:val="left"/>
+            </w:pPr>
+            <w:r>
+              <w:rPr>
+                <w:color w:val="1E293B"/>
+                <w:sz w:val="18"/>
+              </w:rPr>
+              <w:t>https://train-booking-24bda70369-lgzn.vercel.app</w:t>
+            </w:r>
+          </w:p>
+        </w:tc>
+      </w:tr>
+      <w:tr>
+        <w:tc>
+          <w:tcPr>
+            <w:tcW w:type="dxa" w:w="3168"/>
+            <w:shd w:fill="FFFFFF"/>
+            <w:tcMar>
+              <w:top w:w="80" w:type="dxa"/>
+              <w:bottom w:w="80" w:type="dxa"/>
+              <w:left w:w="140" w:type="dxa"/>
+              <w:right w:w="140" w:type="dxa"/>
+            </w:tcMar>
+          </w:tcPr>
+          <w:p>
+            <w:pPr>
+              <w:jc w:val="left"/>
+            </w:pPr>
+            <w:r>
+              <w:rPr>
+                <w:color w:val="1E293B"/>
+                <w:sz w:val="18"/>
+              </w:rPr>
+              <w:t>Core Technology Stack</w:t>
+            </w:r>
+          </w:p>
+        </w:tc>
+        <w:tc>
+          <w:tcPr>
+            <w:tcW w:type="dxa" w:w="5760"/>
+            <w:shd w:fill="FFFFFF"/>
             <w:tcMar>
               <w:top w:w="80" w:type="dxa"/>
               <w:bottom w:w="80" w:type="dxa"/>

</xml_diff>

<commit_message>
chore(config): update production URL to gaddvya-train-booking-lgzn.vercel.app across documentation and deliverables
</commit_message>
<xml_diff>
--- a/TRAIN_TICKET_BOOKING_SYSTEM_PROJECT_REPORT.docx
+++ b/TRAIN_TICKET_BOOKING_SYSTEM_PROJECT_REPORT.docx
@@ -3383,7 +3383,7 @@
         <w:jc w:val="both"/>
       </w:pPr>
       <w:r>
-        <w:t>The platform is continuously integrated and deployed on Vercel with automated GitHub CI/CD pipelines, accessible publicly at: https://train-booking-24bda70369-lgzn.vercel.app</w:t>
+        <w:t>The platform is continuously integrated and deployed on Vercel with automated GitHub CI/CD pipelines, accessible publicly at: https://gaddvya-train-booking-lgzn.vercel.app</w:t>
       </w:r>
     </w:p>
     <w:p>
@@ -21488,7 +21488,7 @@
         <w:br/>
         <w:t># ── Application URLs ──</w:t>
         <w:br/>
-        <w:t>NEXT_PUBLIC_APP_URL=https://train-booking-24bda70369-lgzn.vercel.app</w:t>
+        <w:t>NEXT_PUBLIC_APP_URL=https://gaddvya-train-booking-lgzn.vercel.app</w:t>
         <w:br/>
         <w:t>NEXT_PUBLIC_API_URL=http://localhost:3000</w:t>
       </w:r>
@@ -22071,7 +22071,7 @@
                 <w:color w:val="1E293B"/>
                 <w:sz w:val="18"/>
               </w:rPr>
-              <w:t>https://train-booking-24bda70369-lgzn.vercel.app</w:t>
+              <w:t>https://gaddvya-train-booking-lgzn.vercel.app</w:t>
             </w:r>
           </w:p>
         </w:tc>
@@ -22219,7 +22219,7 @@
         <w:t xml:space="preserve">Step 1: Access the Application: </w:t>
       </w:r>
       <w:r>
-        <w:t>Open any standard modern web browser (Google Chrome, Mozilla Firefox, Microsoft Edge, Safari) and navigate to the live deployment URL: https://train-booking-24bda70369-lgzn.vercel.app</w:t>
+        <w:t>Open any standard modern web browser (Google Chrome, Mozilla Firefox, Microsoft Edge, Safari) and navigate to the live deployment URL: https://gaddvya-train-booking-lgzn.vercel.app</w:t>
       </w:r>
     </w:p>
     <w:p>

</xml_diff>